<commit_message>
(feat: added CeaSDM class and utils for resume generation in 11-resume_generator/)
</commit_message>
<xml_diff>
--- a/11-resume_generator/template/人员简历_模板.docx
+++ b/11-resume_generator/template/人员简历_模板.docx
@@ -126,15 +126,20 @@
               </w:rPr>
               <w:t>{{</w:t>
             </w:r>
-            <w:proofErr w:type="spellStart"/>
-            <w:r>
-              <w:rPr>
-                <w:rFonts w:ascii="宋体" w:hAnsi="宋体" w:hint="eastAsia"/>
-                <w:szCs w:val="21"/>
-              </w:rPr>
-              <w:t>person_name</w:t>
-            </w:r>
-            <w:proofErr w:type="spellEnd"/>
+            <w:r>
+              <w:rPr>
+                <w:rFonts w:ascii="宋体" w:hAnsi="宋体"/>
+                <w:szCs w:val="21"/>
+              </w:rPr>
+              <w:t>Na</w:t>
+            </w:r>
+            <w:r>
+              <w:rPr>
+                <w:rFonts w:ascii="宋体" w:hAnsi="宋体" w:hint="eastAsia"/>
+                <w:szCs w:val="21"/>
+              </w:rPr>
+              <w:t>me</w:t>
+            </w:r>
             <w:r>
               <w:rPr>
                 <w:rFonts w:ascii="宋体" w:hAnsi="宋体" w:hint="eastAsia"/>
@@ -191,15 +196,13 @@
               </w:rPr>
               <w:t>{{</w:t>
             </w:r>
-            <w:proofErr w:type="spellStart"/>
-            <w:r>
-              <w:rPr>
-                <w:rFonts w:ascii="宋体" w:hAnsi="宋体" w:hint="eastAsia"/>
-                <w:szCs w:val="21"/>
-              </w:rPr>
-              <w:t>work_years</w:t>
-            </w:r>
-            <w:proofErr w:type="spellEnd"/>
+            <w:r>
+              <w:rPr>
+                <w:rFonts w:ascii="宋体" w:hAnsi="宋体"/>
+                <w:szCs w:val="21"/>
+              </w:rPr>
+              <w:t>WorkYears</w:t>
+            </w:r>
             <w:r>
               <w:rPr>
                 <w:rFonts w:ascii="宋体" w:hAnsi="宋体" w:hint="eastAsia"/>
@@ -261,10 +264,31 @@
           <w:p>
             <w:pPr>
               <w:rPr>
-                <w:rFonts w:ascii="宋体" w:hAnsi="宋体"/>
-                <w:szCs w:val="21"/>
-              </w:rPr>
-            </w:pPr>
+                <w:rFonts w:ascii="宋体" w:hAnsi="宋体" w:hint="eastAsia"/>
+                <w:szCs w:val="21"/>
+              </w:rPr>
+            </w:pPr>
+            <w:r>
+              <w:rPr>
+                <w:rFonts w:ascii="宋体" w:hAnsi="宋体" w:hint="eastAsia"/>
+                <w:szCs w:val="21"/>
+              </w:rPr>
+              <w:t>{{</w:t>
+            </w:r>
+            <w:r>
+              <w:rPr>
+                <w:rFonts w:ascii="宋体" w:hAnsi="宋体"/>
+                <w:szCs w:val="21"/>
+              </w:rPr>
+              <w:t>GraduationTime</w:t>
+            </w:r>
+            <w:r>
+              <w:rPr>
+                <w:rFonts w:ascii="宋体" w:hAnsi="宋体" w:hint="eastAsia"/>
+                <w:szCs w:val="21"/>
+              </w:rPr>
+              <w:t>}}</w:t>
+            </w:r>
           </w:p>
         </w:tc>
         <w:tc>
@@ -304,10 +328,31 @@
             <w:pPr>
               <w:ind w:firstLineChars="65" w:firstLine="136"/>
               <w:rPr>
-                <w:rFonts w:ascii="宋体" w:hAnsi="宋体"/>
-                <w:szCs w:val="21"/>
-              </w:rPr>
-            </w:pPr>
+                <w:rFonts w:ascii="宋体" w:hAnsi="宋体" w:hint="eastAsia"/>
+                <w:szCs w:val="21"/>
+              </w:rPr>
+            </w:pPr>
+            <w:r>
+              <w:rPr>
+                <w:rFonts w:ascii="宋体" w:hAnsi="宋体" w:hint="eastAsia"/>
+                <w:szCs w:val="21"/>
+              </w:rPr>
+              <w:t>{{</w:t>
+            </w:r>
+            <w:r>
+              <w:rPr>
+                <w:rFonts w:ascii="宋体" w:hAnsi="宋体"/>
+                <w:szCs w:val="21"/>
+              </w:rPr>
+              <w:t>GraduationSchool</w:t>
+            </w:r>
+            <w:r>
+              <w:rPr>
+                <w:rFonts w:ascii="宋体" w:hAnsi="宋体" w:hint="eastAsia"/>
+                <w:szCs w:val="21"/>
+              </w:rPr>
+              <w:t>}}</w:t>
+            </w:r>
           </w:p>
         </w:tc>
       </w:tr>
@@ -362,10 +407,31 @@
           <w:p>
             <w:pPr>
               <w:rPr>
-                <w:rFonts w:ascii="宋体" w:hAnsi="宋体"/>
-                <w:szCs w:val="21"/>
-              </w:rPr>
-            </w:pPr>
+                <w:rFonts w:ascii="宋体" w:hAnsi="宋体" w:hint="eastAsia"/>
+                <w:szCs w:val="21"/>
+              </w:rPr>
+            </w:pPr>
+            <w:r>
+              <w:rPr>
+                <w:rFonts w:ascii="宋体" w:hAnsi="宋体" w:hint="eastAsia"/>
+                <w:szCs w:val="21"/>
+              </w:rPr>
+              <w:t>{{</w:t>
+            </w:r>
+            <w:r>
+              <w:rPr>
+                <w:rFonts w:ascii="宋体" w:hAnsi="宋体"/>
+                <w:szCs w:val="21"/>
+              </w:rPr>
+              <w:t>Major</w:t>
+            </w:r>
+            <w:r>
+              <w:rPr>
+                <w:rFonts w:ascii="宋体" w:hAnsi="宋体" w:hint="eastAsia"/>
+                <w:szCs w:val="21"/>
+              </w:rPr>
+              <w:t>}}</w:t>
+            </w:r>
           </w:p>
         </w:tc>
         <w:tc>
@@ -404,10 +470,31 @@
               <w:ind w:leftChars="67" w:left="141"/>
               <w:jc w:val="left"/>
               <w:rPr>
-                <w:rFonts w:ascii="宋体" w:hAnsi="宋体"/>
-                <w:szCs w:val="21"/>
-              </w:rPr>
-            </w:pPr>
+                <w:rFonts w:ascii="宋体" w:hAnsi="宋体" w:hint="eastAsia"/>
+                <w:szCs w:val="21"/>
+              </w:rPr>
+            </w:pPr>
+            <w:r>
+              <w:rPr>
+                <w:rFonts w:ascii="宋体" w:hAnsi="宋体" w:hint="eastAsia"/>
+                <w:szCs w:val="21"/>
+              </w:rPr>
+              <w:t>{{</w:t>
+            </w:r>
+            <w:r>
+              <w:rPr>
+                <w:rFonts w:ascii="宋体" w:hAnsi="宋体"/>
+                <w:szCs w:val="21"/>
+              </w:rPr>
+              <w:t>HighestEducation</w:t>
+            </w:r>
+            <w:r>
+              <w:rPr>
+                <w:rFonts w:ascii="宋体" w:hAnsi="宋体" w:hint="eastAsia"/>
+                <w:szCs w:val="21"/>
+              </w:rPr>
+              <w:t>}}</w:t>
+            </w:r>
           </w:p>
         </w:tc>
       </w:tr>
@@ -462,10 +549,31 @@
           <w:p>
             <w:pPr>
               <w:rPr>
-                <w:rFonts w:ascii="宋体" w:hAnsi="宋体"/>
-                <w:szCs w:val="21"/>
-              </w:rPr>
-            </w:pPr>
+                <w:rFonts w:ascii="宋体" w:hAnsi="宋体" w:hint="eastAsia"/>
+                <w:szCs w:val="21"/>
+              </w:rPr>
+            </w:pPr>
+            <w:r>
+              <w:rPr>
+                <w:rFonts w:ascii="宋体" w:hAnsi="宋体" w:hint="eastAsia"/>
+                <w:szCs w:val="21"/>
+              </w:rPr>
+              <w:t>{{</w:t>
+            </w:r>
+            <w:r>
+              <w:rPr>
+                <w:rFonts w:ascii="宋体" w:hAnsi="宋体"/>
+                <w:szCs w:val="21"/>
+              </w:rPr>
+              <w:t>Department</w:t>
+            </w:r>
+            <w:r>
+              <w:rPr>
+                <w:rFonts w:ascii="宋体" w:hAnsi="宋体" w:hint="eastAsia"/>
+                <w:szCs w:val="21"/>
+              </w:rPr>
+              <w:t>}}</w:t>
+            </w:r>
           </w:p>
         </w:tc>
         <w:tc>
@@ -503,10 +611,31 @@
             <w:pPr>
               <w:ind w:leftChars="67" w:left="141"/>
               <w:rPr>
-                <w:rFonts w:ascii="宋体" w:hAnsi="宋体"/>
-                <w:szCs w:val="21"/>
-              </w:rPr>
-            </w:pPr>
+                <w:rFonts w:ascii="宋体" w:hAnsi="宋体" w:hint="eastAsia"/>
+                <w:szCs w:val="21"/>
+              </w:rPr>
+            </w:pPr>
+            <w:r>
+              <w:rPr>
+                <w:rFonts w:ascii="宋体" w:hAnsi="宋体" w:hint="eastAsia"/>
+                <w:szCs w:val="21"/>
+              </w:rPr>
+              <w:t>{{</w:t>
+            </w:r>
+            <w:r>
+              <w:rPr>
+                <w:rFonts w:ascii="宋体" w:hAnsi="宋体"/>
+                <w:szCs w:val="21"/>
+              </w:rPr>
+              <w:t>Title</w:t>
+            </w:r>
+            <w:r>
+              <w:rPr>
+                <w:rFonts w:ascii="宋体" w:hAnsi="宋体" w:hint="eastAsia"/>
+                <w:szCs w:val="21"/>
+              </w:rPr>
+              <w:t>}}</w:t>
+            </w:r>
           </w:p>
         </w:tc>
       </w:tr>
@@ -552,12 +681,37 @@
           </w:tcPr>
           <w:p>
             <w:pPr>
-              <w:rPr>
-                <w:rFonts w:ascii="宋体" w:hAnsi="宋体"/>
-                <w:bCs/>
-                <w:szCs w:val="21"/>
-              </w:rPr>
-            </w:pPr>
+              <w:jc w:val="left"/>
+              <w:rPr>
+                <w:rFonts w:ascii="宋体" w:hAnsi="宋体" w:hint="eastAsia"/>
+                <w:bCs/>
+                <w:szCs w:val="21"/>
+              </w:rPr>
+            </w:pPr>
+            <w:r>
+              <w:rPr>
+                <w:rFonts w:ascii="宋体" w:hAnsi="宋体" w:hint="eastAsia"/>
+                <w:bCs/>
+                <w:szCs w:val="21"/>
+              </w:rPr>
+              <w:t>{{</w:t>
+            </w:r>
+            <w:r>
+              <w:rPr>
+                <w:rFonts w:ascii="宋体" w:hAnsi="宋体"/>
+                <w:bCs/>
+                <w:szCs w:val="21"/>
+              </w:rPr>
+              <w:t>PersonalProfile</w:t>
+            </w:r>
+            <w:r>
+              <w:rPr>
+                <w:rFonts w:ascii="宋体" w:hAnsi="宋体" w:hint="eastAsia"/>
+                <w:bCs/>
+                <w:szCs w:val="21"/>
+              </w:rPr>
+              <w:t>}}</w:t>
+            </w:r>
           </w:p>
         </w:tc>
       </w:tr>
@@ -771,11 +925,19 @@
           <w:p>
             <w:pPr>
               <w:rPr>
-                <w:rFonts w:ascii="宋体" w:hAnsi="宋体"/>
-                <w:bCs/>
-                <w:szCs w:val="21"/>
-              </w:rPr>
-            </w:pPr>
+                <w:rFonts w:ascii="宋体" w:hAnsi="宋体" w:hint="eastAsia"/>
+                <w:bCs/>
+                <w:szCs w:val="21"/>
+              </w:rPr>
+            </w:pPr>
+            <w:r>
+              <w:rPr>
+                <w:rFonts w:ascii="宋体" w:hAnsi="宋体"/>
+                <w:bCs/>
+                <w:szCs w:val="21"/>
+              </w:rPr>
+              <w:t>StartTime</w:t>
+            </w:r>
           </w:p>
         </w:tc>
         <w:tc>
@@ -787,11 +949,19 @@
           <w:p>
             <w:pPr>
               <w:rPr>
-                <w:rFonts w:ascii="宋体" w:hAnsi="宋体"/>
-                <w:bCs/>
-                <w:szCs w:val="21"/>
-              </w:rPr>
-            </w:pPr>
+                <w:rFonts w:ascii="宋体" w:hAnsi="宋体" w:hint="eastAsia"/>
+                <w:bCs/>
+                <w:szCs w:val="21"/>
+              </w:rPr>
+            </w:pPr>
+            <w:r>
+              <w:rPr>
+                <w:rFonts w:ascii="宋体" w:hAnsi="宋体"/>
+                <w:bCs/>
+                <w:szCs w:val="21"/>
+              </w:rPr>
+              <w:t>EndTime</w:t>
+            </w:r>
           </w:p>
         </w:tc>
         <w:tc>
@@ -804,11 +974,19 @@
           <w:p>
             <w:pPr>
               <w:rPr>
-                <w:rFonts w:ascii="宋体" w:hAnsi="宋体"/>
-                <w:bCs/>
-                <w:szCs w:val="21"/>
-              </w:rPr>
-            </w:pPr>
+                <w:rFonts w:ascii="宋体" w:hAnsi="宋体" w:hint="eastAsia"/>
+                <w:bCs/>
+                <w:szCs w:val="21"/>
+              </w:rPr>
+            </w:pPr>
+            <w:r>
+              <w:rPr>
+                <w:rFonts w:ascii="宋体" w:hAnsi="宋体"/>
+                <w:bCs/>
+                <w:szCs w:val="21"/>
+              </w:rPr>
+              <w:t>CompanyName</w:t>
+            </w:r>
           </w:p>
         </w:tc>
         <w:tc>
@@ -821,11 +999,19 @@
           <w:p>
             <w:pPr>
               <w:rPr>
-                <w:rFonts w:ascii="宋体" w:hAnsi="宋体"/>
-                <w:bCs/>
-                <w:szCs w:val="21"/>
-              </w:rPr>
-            </w:pPr>
+                <w:rFonts w:ascii="宋体" w:hAnsi="宋体" w:hint="eastAsia"/>
+                <w:bCs/>
+                <w:szCs w:val="21"/>
+              </w:rPr>
+            </w:pPr>
+            <w:r>
+              <w:rPr>
+                <w:rFonts w:ascii="宋体" w:hAnsi="宋体"/>
+                <w:bCs/>
+                <w:szCs w:val="21"/>
+              </w:rPr>
+              <w:t>Position</w:t>
+            </w:r>
           </w:p>
         </w:tc>
         <w:tc>
@@ -837,11 +1023,19 @@
           <w:p>
             <w:pPr>
               <w:rPr>
-                <w:rFonts w:ascii="宋体" w:hAnsi="宋体"/>
-                <w:bCs/>
-                <w:szCs w:val="21"/>
-              </w:rPr>
-            </w:pPr>
+                <w:rFonts w:ascii="宋体" w:hAnsi="宋体" w:hint="eastAsia"/>
+                <w:bCs/>
+                <w:szCs w:val="21"/>
+              </w:rPr>
+            </w:pPr>
+            <w:r>
+              <w:rPr>
+                <w:rFonts w:ascii="宋体" w:hAnsi="宋体"/>
+                <w:bCs/>
+                <w:szCs w:val="21"/>
+              </w:rPr>
+              <w:t>JobDescription</w:t>
+            </w:r>
           </w:p>
         </w:tc>
       </w:tr>
@@ -1082,11 +1276,19 @@
           <w:p>
             <w:pPr>
               <w:rPr>
-                <w:rFonts w:ascii="宋体" w:hAnsi="宋体"/>
-                <w:bCs/>
-                <w:szCs w:val="21"/>
-              </w:rPr>
-            </w:pPr>
+                <w:rFonts w:ascii="宋体" w:hAnsi="宋体" w:hint="eastAsia"/>
+                <w:bCs/>
+                <w:szCs w:val="21"/>
+              </w:rPr>
+            </w:pPr>
+            <w:r>
+              <w:rPr>
+                <w:rFonts w:ascii="宋体" w:hAnsi="宋体"/>
+                <w:bCs/>
+                <w:szCs w:val="21"/>
+              </w:rPr>
+              <w:t>StartTime</w:t>
+            </w:r>
           </w:p>
         </w:tc>
         <w:tc>
@@ -1098,11 +1300,19 @@
           <w:p>
             <w:pPr>
               <w:rPr>
-                <w:rFonts w:ascii="宋体" w:hAnsi="宋体"/>
-                <w:bCs/>
-                <w:szCs w:val="21"/>
-              </w:rPr>
-            </w:pPr>
+                <w:rFonts w:ascii="宋体" w:hAnsi="宋体" w:hint="eastAsia"/>
+                <w:bCs/>
+                <w:szCs w:val="21"/>
+              </w:rPr>
+            </w:pPr>
+            <w:r>
+              <w:rPr>
+                <w:rFonts w:ascii="宋体" w:hAnsi="宋体"/>
+                <w:bCs/>
+                <w:szCs w:val="21"/>
+              </w:rPr>
+              <w:t>EndTime</w:t>
+            </w:r>
           </w:p>
         </w:tc>
         <w:tc>
@@ -1115,11 +1325,19 @@
           <w:p>
             <w:pPr>
               <w:rPr>
-                <w:rFonts w:ascii="宋体" w:hAnsi="宋体"/>
-                <w:bCs/>
-                <w:szCs w:val="21"/>
-              </w:rPr>
-            </w:pPr>
+                <w:rFonts w:ascii="宋体" w:hAnsi="宋体" w:hint="eastAsia"/>
+                <w:bCs/>
+                <w:szCs w:val="21"/>
+              </w:rPr>
+            </w:pPr>
+            <w:r>
+              <w:rPr>
+                <w:rFonts w:ascii="宋体" w:hAnsi="宋体"/>
+                <w:bCs/>
+                <w:szCs w:val="21"/>
+              </w:rPr>
+              <w:t>ProjectName</w:t>
+            </w:r>
           </w:p>
         </w:tc>
         <w:tc>
@@ -1132,11 +1350,19 @@
           <w:p>
             <w:pPr>
               <w:rPr>
-                <w:rFonts w:ascii="宋体" w:hAnsi="宋体"/>
-                <w:bCs/>
-                <w:szCs w:val="21"/>
-              </w:rPr>
-            </w:pPr>
+                <w:rFonts w:ascii="宋体" w:hAnsi="宋体" w:hint="eastAsia"/>
+                <w:bCs/>
+                <w:szCs w:val="21"/>
+              </w:rPr>
+            </w:pPr>
+            <w:r>
+              <w:rPr>
+                <w:rFonts w:ascii="宋体" w:hAnsi="宋体"/>
+                <w:bCs/>
+                <w:szCs w:val="21"/>
+              </w:rPr>
+              <w:t>ProjectRole</w:t>
+            </w:r>
           </w:p>
         </w:tc>
         <w:tc>
@@ -1148,11 +1374,19 @@
           <w:p>
             <w:pPr>
               <w:rPr>
-                <w:rFonts w:ascii="宋体" w:hAnsi="宋体"/>
-                <w:bCs/>
-                <w:szCs w:val="21"/>
-              </w:rPr>
-            </w:pPr>
+                <w:rFonts w:ascii="宋体" w:hAnsi="宋体" w:hint="eastAsia"/>
+                <w:bCs/>
+                <w:szCs w:val="21"/>
+              </w:rPr>
+            </w:pPr>
+            <w:r>
+              <w:rPr>
+                <w:rFonts w:ascii="宋体" w:hAnsi="宋体"/>
+                <w:bCs/>
+                <w:szCs w:val="21"/>
+              </w:rPr>
+              <w:t>JobDescription</w:t>
+            </w:r>
           </w:p>
         </w:tc>
       </w:tr>
@@ -1276,45 +1510,29 @@
             <w:pPr>
               <w:pStyle w:val="4"/>
               <w:rPr>
-                <w:rFonts w:ascii="宋体" w:eastAsia="宋体" w:hAnsi="宋体"/>
+                <w:rFonts w:ascii="宋体" w:hAnsi="宋体"/>
+                <w:bCs/>
+                <w:szCs w:val="21"/>
+              </w:rPr>
+            </w:pPr>
+            <w:r>
+              <w:rPr>
+                <w:rFonts w:ascii="宋体" w:eastAsia="宋体" w:hAnsi="宋体" w:hint="eastAsia"/>
                 <w:bCs/>
                 <w:sz w:val="21"/>
                 <w:szCs w:val="21"/>
                 <w:lang w:eastAsia="zh-CN"/>
               </w:rPr>
-            </w:pPr>
-            <w:r>
-              <w:rPr>
-                <w:rFonts w:ascii="宋体" w:eastAsia="宋体" w:hAnsi="宋体" w:hint="eastAsia"/>
-                <w:bCs/>
-                <w:sz w:val="21"/>
-                <w:szCs w:val="21"/>
-                <w:lang w:eastAsia="zh-CN"/>
-              </w:rPr>
               <w:t>{{</w:t>
             </w:r>
-            <w:proofErr w:type="spellStart"/>
-            <w:r>
-              <w:rPr>
-                <w:rFonts w:ascii="宋体" w:eastAsia="宋体" w:hAnsi="宋体" w:hint="eastAsia"/>
-                <w:bCs/>
-                <w:sz w:val="21"/>
-                <w:szCs w:val="21"/>
-                <w:lang w:eastAsia="zh-CN"/>
-              </w:rPr>
-              <w:t>business</w:t>
-            </w:r>
-            <w:r>
-              <w:rPr>
-                <w:rFonts w:ascii="宋体" w:eastAsia="宋体" w:hAnsi="宋体" w:hint="eastAsia"/>
-                <w:bCs/>
-                <w:sz w:val="21"/>
-                <w:szCs w:val="21"/>
-                <w:lang w:eastAsia="zh-CN"/>
-              </w:rPr>
-              <w:t>_ability</w:t>
-            </w:r>
-            <w:proofErr w:type="spellEnd"/>
+            <w:r>
+              <w:rPr>
+                <w:rFonts w:ascii="宋体" w:hAnsi="宋体"/>
+                <w:bCs/>
+                <w:szCs w:val="21"/>
+              </w:rPr>
+              <w:t>BusinessAbility</w:t>
+            </w:r>
             <w:r>
               <w:rPr>
                 <w:rFonts w:ascii="宋体" w:eastAsia="宋体" w:hAnsi="宋体" w:hint="eastAsia"/>
@@ -1370,45 +1588,29 @@
             <w:pPr>
               <w:pStyle w:val="4"/>
               <w:rPr>
-                <w:rFonts w:ascii="宋体" w:eastAsia="宋体" w:hAnsi="宋体"/>
+                <w:rFonts w:ascii="宋体" w:hAnsi="宋体"/>
+                <w:bCs/>
+                <w:szCs w:val="21"/>
+              </w:rPr>
+            </w:pPr>
+            <w:r>
+              <w:rPr>
+                <w:rFonts w:ascii="宋体" w:eastAsia="宋体" w:hAnsi="宋体" w:hint="eastAsia"/>
                 <w:bCs/>
                 <w:sz w:val="21"/>
                 <w:szCs w:val="21"/>
                 <w:lang w:eastAsia="zh-CN"/>
               </w:rPr>
-            </w:pPr>
-            <w:r>
-              <w:rPr>
-                <w:rFonts w:ascii="宋体" w:eastAsia="宋体" w:hAnsi="宋体" w:hint="eastAsia"/>
-                <w:bCs/>
-                <w:sz w:val="21"/>
-                <w:szCs w:val="21"/>
-                <w:lang w:eastAsia="zh-CN"/>
-              </w:rPr>
               <w:t>{{</w:t>
             </w:r>
-            <w:proofErr w:type="spellStart"/>
-            <w:r>
-              <w:rPr>
-                <w:rFonts w:ascii="宋体" w:eastAsia="宋体" w:hAnsi="宋体" w:hint="eastAsia"/>
-                <w:bCs/>
-                <w:sz w:val="21"/>
-                <w:szCs w:val="21"/>
-                <w:lang w:eastAsia="zh-CN"/>
-              </w:rPr>
-              <w:t>qulity_</w:t>
-            </w:r>
-            <w:r>
-              <w:rPr>
-                <w:rFonts w:ascii="宋体" w:eastAsia="宋体" w:hAnsi="宋体"/>
-                <w:bCs/>
-                <w:sz w:val="21"/>
-                <w:szCs w:val="21"/>
-                <w:lang w:eastAsia="zh-CN"/>
-              </w:rPr>
-              <w:t>certification</w:t>
-            </w:r>
-            <w:proofErr w:type="spellEnd"/>
+            <w:r>
+              <w:rPr>
+                <w:rFonts w:ascii="宋体" w:hAnsi="宋体"/>
+                <w:bCs/>
+                <w:szCs w:val="21"/>
+              </w:rPr>
+              <w:t>Certification</w:t>
+            </w:r>
             <w:r>
               <w:rPr>
                 <w:rFonts w:ascii="宋体" w:eastAsia="宋体" w:hAnsi="宋体" w:hint="eastAsia"/>
@@ -1464,13 +1666,29 @@
             <w:pPr>
               <w:pStyle w:val="4"/>
               <w:rPr>
-                <w:rFonts w:ascii="宋体" w:eastAsia="宋体" w:hAnsi="宋体"/>
+                <w:rFonts w:ascii="宋体" w:hAnsi="宋体"/>
+                <w:bCs/>
+                <w:szCs w:val="21"/>
+              </w:rPr>
+            </w:pPr>
+            <w:r>
+              <w:rPr>
+                <w:rFonts w:ascii="宋体" w:eastAsia="宋体" w:hAnsi="宋体" w:hint="eastAsia"/>
                 <w:bCs/>
                 <w:sz w:val="21"/>
                 <w:szCs w:val="21"/>
                 <w:lang w:eastAsia="zh-CN"/>
               </w:rPr>
-            </w:pPr>
+              <w:t>{{</w:t>
+            </w:r>
+            <w:r>
+              <w:rPr>
+                <w:rFonts w:ascii="宋体" w:hAnsi="宋体"/>
+                <w:bCs/>
+                <w:szCs w:val="21"/>
+              </w:rPr>
+              <w:t>Training</w:t>
+            </w:r>
             <w:r>
               <w:rPr>
                 <w:rFonts w:ascii="宋体" w:eastAsia="宋体" w:hAnsi="宋体" w:hint="eastAsia"/>
@@ -1479,9 +1697,70 @@
                 <w:szCs w:val="21"/>
                 <w:lang w:eastAsia="zh-CN"/>
               </w:rPr>
+              <w:t>}}</w:t>
+            </w:r>
+          </w:p>
+        </w:tc>
+      </w:tr>
+      <w:tr>
+        <w:trPr>
+          <w:trHeight w:val="934"/>
+        </w:trPr>
+        <w:tc>
+          <w:tcPr>
+            <w:tcW w:w="1000" w:type="pct"/>
+            <w:tcMar>
+              <w:top w:w="0" w:type="dxa"/>
+              <w:left w:w="108" w:type="dxa"/>
+              <w:bottom w:w="0" w:type="dxa"/>
+              <w:right w:w="108" w:type="dxa"/>
+            </w:tcMar>
+            <w:vAlign w:val="center"/>
+          </w:tcPr>
+          <w:p>
+            <w:pPr>
+              <w:rPr>
+                <w:rFonts w:ascii="宋体" w:hAnsi="宋体" w:hint="eastAsia"/>
+                <w:bCs/>
+                <w:szCs w:val="21"/>
+              </w:rPr>
+            </w:pPr>
+            <w:r>
+              <w:rPr>
+                <w:rFonts w:ascii="宋体" w:hAnsi="宋体" w:hint="eastAsia"/>
+                <w:bCs/>
+                <w:szCs w:val="21"/>
+              </w:rPr>
+              <w:t>技能标签</w:t>
+            </w:r>
+          </w:p>
+        </w:tc>
+        <w:tc>
+          <w:tcPr>
+            <w:tcW w:w="4000" w:type="pct"/>
+            <w:gridSpan w:val="6"/>
+          </w:tcPr>
+          <w:p>
+            <w:pPr>
+              <w:pStyle w:val="4"/>
+              <w:rPr>
+                <w:rFonts w:ascii="宋体" w:eastAsia="宋体" w:hAnsi="宋体" w:hint="eastAsia"/>
+                <w:bCs/>
+                <w:sz w:val="21"/>
+                <w:szCs w:val="21"/>
+                <w:lang w:eastAsia="zh-CN"/>
+              </w:rPr>
+            </w:pPr>
+            <w:r>
+              <w:rPr>
+                <w:rFonts w:ascii="宋体" w:eastAsia="宋体" w:hAnsi="宋体" w:hint="eastAsia"/>
+                <w:bCs/>
+                <w:sz w:val="21"/>
+                <w:szCs w:val="21"/>
+                <w:lang w:eastAsia="zh-CN"/>
+              </w:rPr>
               <w:t>{{</w:t>
             </w:r>
-            <w:proofErr w:type="spellStart"/>
             <w:r>
               <w:rPr>
                 <w:rFonts w:ascii="宋体" w:eastAsia="宋体" w:hAnsi="宋体" w:hint="eastAsia"/>
@@ -1490,9 +1769,8 @@
                 <w:szCs w:val="21"/>
                 <w:lang w:eastAsia="zh-CN"/>
               </w:rPr>
-              <w:t>participate_training</w:t>
-            </w:r>
-            <w:proofErr w:type="spellEnd"/>
+              <w:t>SkillTag</w:t>
+            </w:r>
             <w:r>
               <w:rPr>
                 <w:rFonts w:ascii="宋体" w:eastAsia="宋体" w:hAnsi="宋体" w:hint="eastAsia"/>
@@ -2296,7 +2574,6 @@
   <w:style w:type="character" w:default="1" w:styleId="a0">
     <w:name w:val="Default Paragraph Font"/>
     <w:uiPriority w:val="1"/>
-    <w:semiHidden/>
     <w:unhideWhenUsed/>
   </w:style>
   <w:style w:type="table" w:default="1" w:styleId="a1">

</xml_diff>